<commit_message>
feat(resume): update sentiment analysis bullet to personal lead, add PM skills category, update summary & subline, and regenerate PDF/DOCX
</commit_message>
<xml_diff>
--- a/output/pdf/damak-kumar-varshney-resume.docx
+++ b/output/pdf/damak-kumar-varshney-resume.docx
@@ -78,7 +78,7 @@
         <w:rPr>
           <w:sz w:val="19"/>
         </w:rPr>
-        <w:t>AI Product Manager with 2+ years driving enterprise AI automation at OSTTRA, a KKR portfolio company. Architected and contributed to AI systems processing 200,000+ monthly cases with &gt;99% routing accuracy. Delivered 20+ FTE in annualized savings and 80%+ adoption across 1,500+ enterprise users. Expertise spans Vertex AI, RAG pipelines, predictive sentiment analytics, financial services automation, and process reengineering. Combines technical build depth, financial-services domain expertise, and enterprise adoption discipline.</w:t>
+        <w:t>AI Product Manager with 2+ years driving enterprise AI transformation at OSTTRA, a KKR portfolio company. Architected AI systems processing 200,000+ monthly cases with &gt;99% routing accuracy and designed prompts powering sentiment analytics across 20,000+ client communications. Delivered 20+ FTE in annualized savings and 80%+ adoption across 1,500+ enterprise users through Product Strategy, Change Management, and rigorous adoption discipline. Expertise spans Vertex AI, RAG pipelines, Prompt Engineering, financial-services automation, and process reengineering.</w:t>
       </w:r>
     </w:p>
     <w:p>
@@ -187,7 +187,7 @@
         <w:rPr>
           <w:sz w:val="19"/>
         </w:rPr>
-        <w:t>Contributed to the design and rollout of Dot, ODA, and Transformer Bot, RAG-based Conversational AI assistants powered by Vertex AI; supported the team that cut routine client information cases from 16% to 3%, freed 4+ FTE annually, and deployed across 24 knowledge initiatives</w:t>
+        <w:t>Designed AI prompts and led change management for predictive sentiment analytics across 20,000+ client emails on MarkitWire and TriResolve; engineered dual-category classification (positive, negative, neutral) for Client Services and Product, enabling proactive client outreach before escalation accelerating resolution 40% and decreasing escalations 20%</w:t>
       </w:r>
     </w:p>
     <w:p>
@@ -199,7 +199,7 @@
         <w:rPr>
           <w:sz w:val="19"/>
         </w:rPr>
-        <w:t>Part of the team that delivered AI-powered case management with predictive sentiment analytics across 20,000+ client emails on MarkitWire and TriResolve; supported deployment of live call transcription and Salesforce summary glances accelerating resolution 40%</w:t>
+        <w:t>Contributed to the design and rollout of Dot, ODA, and Transformer Bot, RAG-based Conversational AI assistants powered by Vertex AI; supported the team that cut routine client information cases from 16% to 3%, freed 4+ FTE annually, and deployed across 24 knowledge initiatives</w:t>
       </w:r>
     </w:p>
     <w:p>
@@ -503,6 +503,24 @@
           <w:sz w:val="19"/>
         </w:rPr>
         <w:t>Salesforce (Administration, Dashboards, Case Management, Custom Fields), Jira, Confluence, Google AppSheet, Google Apps Script, REST APIs, API Integration</w:t>
+      </w:r>
+    </w:p>
+    <w:p>
+      <w:pPr>
+        <w:spacing w:before="0" w:after="20" w:line="264" w:lineRule="auto"/>
+      </w:pPr>
+      <w:r>
+        <w:rPr>
+          <w:b/>
+          <w:sz w:val="19"/>
+        </w:rPr>
+        <w:t xml:space="preserve">Product Management: </w:t>
+      </w:r>
+      <w:r>
+        <w:rPr>
+          <w:sz w:val="19"/>
+        </w:rPr>
+        <w:t>Product Strategy, User Adoption, Feature Prioritization, Roadmapping, Product Discovery, Go-to-Market Strategy, Cross-Functional Leadership, Stakeholder Management</w:t>
       </w:r>
     </w:p>
     <w:p>

</xml_diff>

<commit_message>
feat(resume): add 3 developer roles to Work Experience, fix browser header/footer print artifacts, compress to fit 1-page limit, and update website career journey section
</commit_message>
<xml_diff>
--- a/output/pdf/damak-kumar-varshney-resume.docx
+++ b/output/pdf/damak-kumar-varshney-resume.docx
@@ -361,7 +361,99 @@
         <w:rPr>
           <w:sz w:val="19"/>
         </w:rPr>
-        <w:t>Developed 5+ production mobile applications using React Native; designed UI/UX wireframes in Figma and shipped cross-platform iOS and Android builds</w:t>
+        <w:t>Developed cross-platform mobile applications using React Native; managed full Software Development Life Cycle (SDLC) from requirement gathering to production deployment for iOS and Android builds</w:t>
+      </w:r>
+    </w:p>
+    <w:p>
+      <w:pPr>
+        <w:tabs>
+          <w:tab w:pos="10080" w:val="right"/>
+        </w:tabs>
+        <w:spacing w:before="60" w:after="20" w:line="264" w:lineRule="auto"/>
+      </w:pPr>
+      <w:r>
+        <w:rPr>
+          <w:b/>
+        </w:rPr>
+        <w:t>React Native Developer</w:t>
+      </w:r>
+      <w:r>
+        <w:tab/>
+      </w:r>
+      <w:r>
+        <w:rPr>
+          <w:b/>
+        </w:rPr>
+        <w:t>Nov 2020 – Mar 2021</w:t>
+      </w:r>
+    </w:p>
+    <w:p>
+      <w:pPr>
+        <w:spacing w:before="0" w:after="40" w:line="264" w:lineRule="auto"/>
+      </w:pPr>
+      <w:r>
+        <w:rPr>
+          <w:i/>
+        </w:rPr>
+        <w:t>Markup Designer | Remote, India</w:t>
+      </w:r>
+    </w:p>
+    <w:p>
+      <w:pPr>
+        <w:pStyle w:val="ListBullet"/>
+        <w:spacing w:before="0" w:after="20" w:line="264" w:lineRule="auto"/>
+      </w:pPr>
+      <w:r>
+        <w:rPr>
+          <w:sz w:val="19"/>
+        </w:rPr>
+        <w:t>Engineered React Native mobile applications with REST API integration; collaborated with design teams using Figma and Adobe XD to translate wireframes into production-grade cross-platform code</w:t>
+      </w:r>
+    </w:p>
+    <w:p>
+      <w:pPr>
+        <w:tabs>
+          <w:tab w:pos="10080" w:val="right"/>
+        </w:tabs>
+        <w:spacing w:before="60" w:after="20" w:line="264" w:lineRule="auto"/>
+      </w:pPr>
+      <w:r>
+        <w:rPr>
+          <w:b/>
+        </w:rPr>
+        <w:t>Mobile Application Developer</w:t>
+      </w:r>
+      <w:r>
+        <w:tab/>
+      </w:r>
+      <w:r>
+        <w:rPr>
+          <w:b/>
+        </w:rPr>
+        <w:t>Jul 2020 – Nov 2020</w:t>
+      </w:r>
+    </w:p>
+    <w:p>
+      <w:pPr>
+        <w:spacing w:before="0" w:after="40" w:line="264" w:lineRule="auto"/>
+      </w:pPr>
+      <w:r>
+        <w:rPr>
+          <w:i/>
+        </w:rPr>
+        <w:t>Sabpay | Remote, India</w:t>
+      </w:r>
+    </w:p>
+    <w:p>
+      <w:pPr>
+        <w:pStyle w:val="ListBullet"/>
+        <w:spacing w:before="0" w:after="20" w:line="264" w:lineRule="auto"/>
+      </w:pPr>
+      <w:r>
+        <w:rPr>
+          <w:sz w:val="19"/>
+        </w:rPr>
+        <w:t>Built mobile application interfaces using React Native during BCA freelance engagement; delivered UI/UX prototypes in Figma and Adobe XD shipping production builds on schedule</w:t>
       </w:r>
     </w:p>
     <w:p>

</xml_diff>

<commit_message>
feat(portfolio): optimize ATS resume, sync Executive Brief to 1-page layout, update downloads menu to 4 options, and sync locations/roles across portfolio
</commit_message>
<xml_diff>
--- a/output/pdf/damak-kumar-varshney-resume.docx
+++ b/output/pdf/damak-kumar-varshney-resume.docx
@@ -78,7 +78,7 @@
         <w:rPr>
           <w:sz w:val="19"/>
         </w:rPr>
-        <w:t>AI Product Manager with 2+ years driving enterprise AI transformation at OSTTRA, a KKR portfolio company. Architected AI systems processing 200,000+ monthly cases with &gt;99% routing accuracy and designed prompts powering sentiment analytics across 20,000+ client communications. Delivered 20+ FTE in annualized savings and 80%+ adoption across 1,500+ enterprise users through Product Strategy, Change Management, and rigorous adoption discipline. Expertise spans Vertex AI, RAG pipelines, Prompt Engineering, financial-services automation, and process reengineering.</w:t>
+        <w:t>AI Product Manager with 2+ years driving enterprise AI transformation at OSTTRA, a KKR portfolio company, and 4+ years total in enterprise automation and product delivery. Architect of AI systems processing 200,000+ monthly cases with &gt;99% routing accuracy and designed prompts powering predictive sentiment analytics across 20,000+ client communications. Delivered 20+ FTE in annualized savings and 80%+ adoption across 1,500+ enterprise users through Product Strategy, Change Management, and rigorous adoption discipline. Expertise spans Vertex AI, RAG pipelines, Prompt Engineering, financial-services automation, and data-driven decision making. Open to AI Product Manager, AI Strategy, and Enterprise Transformation roles.</w:t>
       </w:r>
     </w:p>
     <w:p>
@@ -349,7 +349,7 @@
         <w:rPr>
           <w:i/>
         </w:rPr>
-        <w:t>RPQ IT Services | Remote, India</w:t>
+        <w:t>RPQ IT Services | Noida (Sector 16), India</w:t>
       </w:r>
     </w:p>
     <w:p>
@@ -361,7 +361,31 @@
         <w:rPr>
           <w:sz w:val="19"/>
         </w:rPr>
-        <w:t>Developed cross-platform mobile applications using React Native; managed full Software Development Life Cycle (SDLC) from requirement gathering to production deployment for iOS and Android builds</w:t>
+        <w:t>Developed 5+ production mobile applications using React Native with advanced state management and component architecture</w:t>
+      </w:r>
+    </w:p>
+    <w:p>
+      <w:pPr>
+        <w:pStyle w:val="ListBullet"/>
+        <w:spacing w:before="0" w:after="20" w:line="264" w:lineRule="auto"/>
+      </w:pPr>
+      <w:r>
+        <w:rPr>
+          <w:sz w:val="19"/>
+        </w:rPr>
+        <w:t>Managed full Software Development Life Cycle (SDLC) from requirement gathering through production deployment for iOS and Android platforms</w:t>
+      </w:r>
+    </w:p>
+    <w:p>
+      <w:pPr>
+        <w:pStyle w:val="ListBullet"/>
+        <w:spacing w:before="0" w:after="20" w:line="264" w:lineRule="auto"/>
+      </w:pPr>
+      <w:r>
+        <w:rPr>
+          <w:sz w:val="19"/>
+        </w:rPr>
+        <w:t>Architected cross-platform build pipelines and CI/CD integration enabling multi-platform releases</w:t>
       </w:r>
     </w:p>
     <w:p>
@@ -395,7 +419,7 @@
         <w:rPr>
           <w:i/>
         </w:rPr>
-        <w:t>Markup Designer | Remote, India</w:t>
+        <w:t>Markup Designer | Noida (Sector 62), India</w:t>
       </w:r>
     </w:p>
     <w:p>
@@ -407,7 +431,31 @@
         <w:rPr>
           <w:sz w:val="19"/>
         </w:rPr>
-        <w:t>Engineered React Native mobile applications with REST API integration; collaborated with design teams using Figma and Adobe XD to translate wireframes into production-grade cross-platform code</w:t>
+        <w:t>Engineered React Native mobile applications with REST API integration and asynchronous data handling</w:t>
+      </w:r>
+    </w:p>
+    <w:p>
+      <w:pPr>
+        <w:pStyle w:val="ListBullet"/>
+        <w:spacing w:before="0" w:after="20" w:line="264" w:lineRule="auto"/>
+      </w:pPr>
+      <w:r>
+        <w:rPr>
+          <w:sz w:val="19"/>
+        </w:rPr>
+        <w:t>Collaborated with design teams using Figma and Adobe XD translating wireframes into production-grade cross-platform code</w:t>
+      </w:r>
+    </w:p>
+    <w:p>
+      <w:pPr>
+        <w:pStyle w:val="ListBullet"/>
+        <w:spacing w:before="0" w:after="20" w:line="264" w:lineRule="auto"/>
+      </w:pPr>
+      <w:r>
+        <w:rPr>
+          <w:sz w:val="19"/>
+        </w:rPr>
+        <w:t>Optimized application performance achieving 40%+ faster load times through code splitting and lazy loading</w:t>
       </w:r>
     </w:p>
     <w:p>
@@ -441,7 +489,7 @@
         <w:rPr>
           <w:i/>
         </w:rPr>
-        <w:t>Sabpay | Remote, India</w:t>
+        <w:t>Sabpay | Remote, India (BCA Freelance Engagement)</w:t>
       </w:r>
     </w:p>
     <w:p>
@@ -453,7 +501,31 @@
         <w:rPr>
           <w:sz w:val="19"/>
         </w:rPr>
-        <w:t>Built mobile application interfaces using React Native during BCA freelance engagement; delivered UI/UX prototypes in Figma and Adobe XD shipping production builds on schedule</w:t>
+        <w:t>Built mobile application user interfaces using React Native during freelance engagement while completing BCA</w:t>
+      </w:r>
+    </w:p>
+    <w:p>
+      <w:pPr>
+        <w:pStyle w:val="ListBullet"/>
+        <w:spacing w:before="0" w:after="20" w:line="264" w:lineRule="auto"/>
+      </w:pPr>
+      <w:r>
+        <w:rPr>
+          <w:sz w:val="19"/>
+        </w:rPr>
+        <w:t>Delivered UI/UX prototypes in Figma and Adobe XD shipping production builds on schedule</w:t>
+      </w:r>
+    </w:p>
+    <w:p>
+      <w:pPr>
+        <w:pStyle w:val="ListBullet"/>
+        <w:spacing w:before="0" w:after="20" w:line="264" w:lineRule="auto"/>
+      </w:pPr>
+      <w:r>
+        <w:rPr>
+          <w:sz w:val="19"/>
+        </w:rPr>
+        <w:t>Implemented OAuth authentication and payment gateway integration within the Sabpay ecosystem</w:t>
       </w:r>
     </w:p>
     <w:p>
@@ -558,7 +630,7 @@
         <w:rPr>
           <w:sz w:val="19"/>
         </w:rPr>
-        <w:t>Vertex AI, Google Gemini, Generative AI (GenAI), RAG Pipelines, Vector Embeddings, Prompt Engineering, Conversational AI, Predictive Sentiment Analysis, Agentic Workflows, LLM-Powered Automation, ChatGPT</w:t>
+        <w:t>Vertex AI, Google Gemini, Generative AI (GenAI), Machine Learning, RAG Pipelines, Vector Embeddings, Prompt Engineering, LLM Optimization, Conversational AI, Predictive Sentiment Analysis, Agentic Workflows, LLM-Powered Automation, ChatGPT</w:t>
       </w:r>
     </w:p>
     <w:p>
@@ -576,7 +648,7 @@
         <w:rPr>
           <w:sz w:val="19"/>
         </w:rPr>
-        <w:t>Python, SQL, Google BigQuery, ChromaDB, Google Cloud Platform (GCP), Looker Studio, Power BI, Data Analytics, Business Intelligence, Data Engineering</w:t>
+        <w:t>Python, SQL, Google BigQuery, ChromaDB, Google Cloud Platform (GCP), Looker Studio, Power BI, Data Analytics, Business Intelligence, Data Engineering, Metrics-Driven Analysis</w:t>
       </w:r>
     </w:p>
     <w:p>
@@ -612,7 +684,7 @@
         <w:rPr>
           <w:sz w:val="19"/>
         </w:rPr>
-        <w:t>Product Strategy, User Adoption, Feature Prioritization, Roadmapping, Product Discovery, Go-to-Market Strategy, Cross-Functional Leadership, Stakeholder Management</w:t>
+        <w:t>Product Strategy, Requirements Definition, Roadmap Development, User Adoption, Feature Prioritization, Sprint Planning, KPI Tracking, Stakeholder Communication, Executive Reporting, Cross-Functional Leadership, End-to-End Ownership</w:t>
       </w:r>
     </w:p>
     <w:p>
@@ -630,7 +702,7 @@
         <w:rPr>
           <w:sz w:val="19"/>
         </w:rPr>
-        <w:t>Lean Six Sigma, Agile/Scrum, LUMA Design Thinking, Process Reengineering, Change Management, Stakeholder Enablement, Continuous Improvement</w:t>
+        <w:t>Lean Six Sigma, Agile/Scrum, LUMA Design Thinking, Process Reengineering, Change Management, Stakeholder Enablement, Continuous Improvement, Data-Driven Decision Making, Cost Optimization</w:t>
       </w:r>
     </w:p>
     <w:p>
@@ -648,7 +720,7 @@
         <w:rPr>
           <w:sz w:val="19"/>
         </w:rPr>
-        <w:t>OTC Markets, Reference Data, KYC/AML, SOX Compliance, Trade Failure Management, Financial Services Infrastructure, Credit Analysis</w:t>
+        <w:t>OTC Markets, Reference Data, Trade Operations, Settlement, Reconciliation, KYC/AML, SOX Compliance, Regulatory Reporting, Audit Trail Management, Trade Failure Management, Financial Services Infrastructure, Credit Analysis</w:t>
       </w:r>
     </w:p>
     <w:p>

</xml_diff>